<commit_message>
Credit separate XSS NAXSI contribution
</commit_message>
<xml_diff>
--- a/reports/final/COMP6015_Group11_WAF_Final_Report_SubmissionReady.docx
+++ b/reports/final/COMP6015_Group11_WAF_Final_Report_SubmissionReady.docx
@@ -151,7 +151,7 @@
           <w:p>
             <w:r>
               <w:rPr/>
-              <w:t xml:space="preserve">Payload testing support and result checking.</w:t>
+              <w:t xml:space="preserve">Separate XSS/NAXSI payload evidence contribution and result checking. The current quantitative claims use only evidence files present in this cleaned repository.</w:t>
             </w:r>
           </w:p>
         </w:tc>
@@ -326,7 +326,7 @@
     </w:p>
     <w:p>
       <w:r>
-        <w:t xml:space="preserve">Older draft wording referred to focused NAXSI/XSS artefacts outside this package. Those files are not present in the cleaned evidence tree, so the revised report avoids unsupported NAXSI conclusions.</w:t>
+        <w:t xml:space="preserve">A separate XSS/NAXSI contribution was provided by a group member. However, the cleaned repository currently does not contain the source CSVs or screenshots for that package. To keep the report accurate, this version credits that contribution in the student details but does not include NAXSI performance figures as verified quantitative evidence. Those figures can be added later if the source evidence is added to the submission package.</w:t>
       </w:r>
     </w:p>
     <w:p>

</xml_diff>